<commit_message>
Adding NodeJS with Docker Compose notes
</commit_message>
<xml_diff>
--- a/Nodejs/My-Notes/NodeJS-Notes-03.docx
+++ b/Nodejs/My-Notes/NodeJS-Notes-03.docx
@@ -255,7 +255,24 @@
           <w:sz w:val="28"/>
           <w:szCs w:val="28"/>
         </w:rPr>
-        <w:t xml:space="preserve">: </w:t>
+        <w:t>: openssl</w:t>
+      </w:r>
+      <w:r>
+        <w:rPr>
+          <w:rFonts w:ascii="Sakkal Majalla" w:hAnsi="Sakkal Majalla" w:cs="Sakkal Majalla"/>
+          <w:color w:val="0070C0"/>
+          <w:sz w:val="28"/>
+          <w:szCs w:val="28"/>
+        </w:rPr>
+        <w:t xml:space="preserve"> </w:t>
+      </w:r>
+      <w:r>
+        <w:rPr>
+          <w:rFonts w:ascii="Sakkal Majalla" w:hAnsi="Sakkal Majalla" w:cs="Sakkal Majalla"/>
+          <w:sz w:val="28"/>
+          <w:szCs w:val="28"/>
+        </w:rPr>
+        <w:t>req -nodes -new -x509 -</w:t>
       </w:r>
       <w:r>
         <w:rPr>
@@ -266,7 +283,7 @@
           <w:sz w:val="28"/>
           <w:szCs w:val="28"/>
         </w:rPr>
-        <w:t>openssl</w:t>
+        <w:t>keyout</w:t>
       </w:r>
       <w:r>
         <w:rPr>
@@ -283,7 +300,7 @@
           <w:sz w:val="28"/>
           <w:szCs w:val="28"/>
         </w:rPr>
-        <w:t>req -nodes -new -x509 -</w:t>
+        <w:t>recipe-api/tls/</w:t>
       </w:r>
       <w:r>
         <w:rPr>
@@ -294,7 +311,7 @@
           <w:sz w:val="28"/>
           <w:szCs w:val="28"/>
         </w:rPr>
-        <w:t>keyout</w:t>
+        <w:t>basic-private-key.key</w:t>
       </w:r>
       <w:r>
         <w:rPr>
@@ -311,7 +328,7 @@
           <w:sz w:val="28"/>
           <w:szCs w:val="28"/>
         </w:rPr>
-        <w:t>recipe-api/tls/</w:t>
+        <w:t>-</w:t>
       </w:r>
       <w:r>
         <w:rPr>
@@ -322,7 +339,7 @@
           <w:sz w:val="28"/>
           <w:szCs w:val="28"/>
         </w:rPr>
-        <w:t>basic-private-key.key</w:t>
+        <w:t>out</w:t>
       </w:r>
       <w:r>
         <w:rPr>
@@ -339,7 +356,7 @@
           <w:sz w:val="28"/>
           <w:szCs w:val="28"/>
         </w:rPr>
-        <w:t>-</w:t>
+        <w:t>shared/tls/</w:t>
       </w:r>
       <w:r>
         <w:rPr>
@@ -350,12 +367,75 @@
           <w:sz w:val="28"/>
           <w:szCs w:val="28"/>
         </w:rPr>
-        <w:t>out</w:t>
-      </w:r>
-      <w:r>
-        <w:rPr>
-          <w:rFonts w:ascii="Sakkal Majalla" w:hAnsi="Sakkal Majalla" w:cs="Sakkal Majalla"/>
-          <w:color w:val="0070C0"/>
+        <w:t>basic-certificate.cert</w:t>
+      </w:r>
+    </w:p>
+    <w:p>
+      <w:pPr>
+        <w:ind w:left="720" w:firstLine="720"/>
+        <w:rPr>
+          <w:rFonts w:ascii="Sakkal Majalla" w:hAnsi="Sakkal Majalla" w:cs="Sakkal Majalla"/>
+          <w:sz w:val="28"/>
+          <w:szCs w:val="28"/>
+        </w:rPr>
+      </w:pPr>
+      <w:r>
+        <w:rPr>
+          <w:rFonts w:ascii="Sakkal Majalla" w:hAnsi="Sakkal Majalla" w:cs="Sakkal Majalla"/>
+          <w:sz w:val="28"/>
+          <w:szCs w:val="28"/>
+        </w:rPr>
+        <w:t>*************************************************************</w:t>
+      </w:r>
+    </w:p>
+    <w:p>
+      <w:pPr>
+        <w:rPr>
+          <w:rFonts w:ascii="Sakkal Majalla" w:hAnsi="Sakkal Majalla" w:cs="Sakkal Majalla"/>
+          <w:b/>
+          <w:bCs/>
+          <w:color w:val="002060"/>
+          <w:sz w:val="28"/>
+          <w:szCs w:val="28"/>
+        </w:rPr>
+      </w:pPr>
+    </w:p>
+    <w:p>
+      <w:pPr>
+        <w:rPr>
+          <w:rFonts w:ascii="Sakkal Majalla" w:hAnsi="Sakkal Majalla" w:cs="Sakkal Majalla"/>
+          <w:b/>
+          <w:bCs/>
+          <w:color w:val="002060"/>
+          <w:sz w:val="28"/>
+          <w:szCs w:val="28"/>
+        </w:rPr>
+      </w:pPr>
+    </w:p>
+    <w:p>
+      <w:pPr>
+        <w:rPr>
+          <w:rFonts w:ascii="Sakkal Majalla" w:hAnsi="Sakkal Majalla" w:cs="Sakkal Majalla"/>
+          <w:sz w:val="28"/>
+          <w:szCs w:val="28"/>
+        </w:rPr>
+      </w:pPr>
+      <w:r>
+        <w:rPr>
+          <w:rFonts w:ascii="Sakkal Majalla" w:hAnsi="Sakkal Majalla" w:cs="Sakkal Majalla"/>
+          <w:b/>
+          <w:bCs/>
+          <w:color w:val="002060"/>
+          <w:sz w:val="28"/>
+          <w:szCs w:val="28"/>
+        </w:rPr>
+        <w:lastRenderedPageBreak/>
+        <w:t>Note</w:t>
+      </w:r>
+      <w:r>
+        <w:rPr>
+          <w:rFonts w:ascii="Sakkal Majalla" w:hAnsi="Sakkal Majalla" w:cs="Sakkal Majalla"/>
+          <w:color w:val="002060"/>
           <w:sz w:val="28"/>
           <w:szCs w:val="28"/>
         </w:rPr>
@@ -367,7 +447,102 @@
           <w:sz w:val="28"/>
           <w:szCs w:val="28"/>
         </w:rPr>
-        <w:t>shared/tls/</w:t>
+        <w:t>(</w:t>
+      </w:r>
+      <w:r>
+        <w:rPr>
+          <w:rFonts w:ascii="Sakkal Majalla" w:hAnsi="Sakkal Majalla" w:cs="Sakkal Majalla"/>
+          <w:b/>
+          <w:bCs/>
+          <w:color w:val="3A7C22" w:themeColor="accent6" w:themeShade="BF"/>
+          <w:sz w:val="28"/>
+          <w:szCs w:val="28"/>
+        </w:rPr>
+        <w:t>to remember</w:t>
+      </w:r>
+      <w:r>
+        <w:rPr>
+          <w:rFonts w:ascii="Sakkal Majalla" w:hAnsi="Sakkal Majalla" w:cs="Sakkal Majalla"/>
+          <w:sz w:val="28"/>
+          <w:szCs w:val="28"/>
+        </w:rPr>
+        <w:t>): When building the</w:t>
+      </w:r>
+      <w:r>
+        <w:rPr>
+          <w:rFonts w:ascii="Sakkal Majalla" w:hAnsi="Sakkal Majalla" w:cs="Sakkal Majalla"/>
+          <w:sz w:val="28"/>
+          <w:szCs w:val="28"/>
+        </w:rPr>
+        <w:t xml:space="preserve"> </w:t>
+      </w:r>
+      <w:r>
+        <w:rPr>
+          <w:rFonts w:ascii="Sakkal Majalla" w:hAnsi="Sakkal Majalla" w:cs="Sakkal Majalla"/>
+          <w:sz w:val="28"/>
+          <w:szCs w:val="28"/>
+        </w:rPr>
+        <w:t xml:space="preserve">microservices using </w:t>
+      </w:r>
+      <w:r>
+        <w:rPr>
+          <w:rFonts w:ascii="Sakkal Majalla" w:hAnsi="Sakkal Majalla" w:cs="Sakkal Majalla"/>
+          <w:sz w:val="28"/>
+          <w:szCs w:val="28"/>
+        </w:rPr>
+        <w:t>D</w:t>
+      </w:r>
+      <w:r>
+        <w:rPr>
+          <w:rFonts w:ascii="Sakkal Majalla" w:hAnsi="Sakkal Majalla" w:cs="Sakkal Majalla"/>
+          <w:sz w:val="28"/>
+          <w:szCs w:val="28"/>
+        </w:rPr>
+        <w:t xml:space="preserve">ocker </w:t>
+      </w:r>
+      <w:r>
+        <w:rPr>
+          <w:rFonts w:ascii="Sakkal Majalla" w:hAnsi="Sakkal Majalla" w:cs="Sakkal Majalla"/>
+          <w:sz w:val="28"/>
+          <w:szCs w:val="28"/>
+        </w:rPr>
+        <w:t>C</w:t>
+      </w:r>
+      <w:r>
+        <w:rPr>
+          <w:rFonts w:ascii="Sakkal Majalla" w:hAnsi="Sakkal Majalla" w:cs="Sakkal Majalla"/>
+          <w:sz w:val="28"/>
+          <w:szCs w:val="28"/>
+        </w:rPr>
+        <w:t>ompose</w:t>
+      </w:r>
+      <w:r>
+        <w:rPr>
+          <w:rFonts w:ascii="Sakkal Majalla" w:hAnsi="Sakkal Majalla" w:cs="Sakkal Majalla"/>
+          <w:sz w:val="28"/>
+          <w:szCs w:val="28"/>
+        </w:rPr>
+        <w:t>, build the images without caching to reflect all changes to the destination images.</w:t>
+      </w:r>
+    </w:p>
+    <w:p>
+      <w:pPr>
+        <w:rPr>
+          <w:rFonts w:ascii="Sakkal Majalla" w:hAnsi="Sakkal Majalla" w:cs="Sakkal Majalla"/>
+          <w:b/>
+          <w:bCs/>
+          <w:color w:val="C00000"/>
+          <w:sz w:val="28"/>
+          <w:szCs w:val="28"/>
+        </w:rPr>
+      </w:pPr>
+      <w:r>
+        <w:rPr>
+          <w:rFonts w:ascii="Sakkal Majalla" w:hAnsi="Sakkal Majalla" w:cs="Sakkal Majalla"/>
+          <w:sz w:val="28"/>
+          <w:szCs w:val="28"/>
+        </w:rPr>
+        <w:t xml:space="preserve">Ex: </w:t>
       </w:r>
       <w:r>
         <w:rPr>
@@ -378,7 +553,40 @@
           <w:sz w:val="28"/>
           <w:szCs w:val="28"/>
         </w:rPr>
-        <w:t>basic-certificate.cert</w:t>
+        <w:t xml:space="preserve">docker-compose </w:t>
+      </w:r>
+      <w:r>
+        <w:rPr>
+          <w:rFonts w:ascii="Sakkal Majalla" w:hAnsi="Sakkal Majalla" w:cs="Sakkal Majalla"/>
+          <w:b/>
+          <w:bCs/>
+          <w:color w:val="C00000"/>
+          <w:sz w:val="28"/>
+          <w:szCs w:val="28"/>
+        </w:rPr>
+        <w:t xml:space="preserve">build </w:t>
+      </w:r>
+      <w:r>
+        <w:rPr>
+          <w:rFonts w:ascii="Sakkal Majalla" w:hAnsi="Sakkal Majalla" w:cs="Sakkal Majalla"/>
+          <w:b/>
+          <w:bCs/>
+          <w:color w:val="3A7C22" w:themeColor="accent6" w:themeShade="BF"/>
+          <w:sz w:val="28"/>
+          <w:szCs w:val="28"/>
+        </w:rPr>
+        <w:t xml:space="preserve">--no-cache </w:t>
+      </w:r>
+      <w:r>
+        <w:rPr>
+          <w:rFonts w:ascii="Sakkal Majalla" w:hAnsi="Sakkal Majalla" w:cs="Sakkal Majalla"/>
+          <w:b/>
+          <w:bCs/>
+          <w:color w:val="C00000"/>
+          <w:sz w:val="28"/>
+          <w:szCs w:val="28"/>
+        </w:rPr>
+        <w:t>user-service</w:t>
       </w:r>
     </w:p>
     <w:p>
@@ -818,6 +1026,7 @@
   <w:style w:type="paragraph" w:default="1" w:styleId="Normal">
     <w:name w:val="Normal"/>
     <w:qFormat/>
+    <w:rsid w:val="00EC127D"/>
   </w:style>
   <w:style w:type="paragraph" w:styleId="Heading1">
     <w:name w:val="heading 1"/>

</xml_diff>